<commit_message>
minor changes to content and scope
</commit_message>
<xml_diff>
--- a/planning/Ember-and-Oak-planning.docx
+++ b/planning/Ember-and-Oak-planning.docx
@@ -51,7 +51,7 @@
         <w:spacing w:after="120"/>
       </w:pPr>
       <w:r>
-        <w:t xml:space="preserve">Ember &amp; Oak is a fictional neighbourhood coffee shop built for students and young workers who want a good coffee at a fair price and a place to study for hours. The site has three pages: a homepage, a menu subpage and a content page that tells the café's story. This document plans who the site is for, how they move through it, how the pages connect, what each page looks like and the visual design.</w:t>
+        <w:t xml:space="preserve">Ember &amp; Oak is a fictional student café at North Spine, Nanyang Technological University (NTU), Singapore. It is built for students who want good kopi or coffee at a fair price and a place to study for hours after Lee Wee Nam Library (also in North Spine) closes at 9.30pm on weeknights. The site has three pages: a homepage, a menu subpage and a content page that tells the café's story. This document plans who the site is for, how they move through it, how the pages connect, what each page looks like and the visual design.</w:t>
       </w:r>
     </w:p>
     <w:p>
@@ -181,7 +181,7 @@
                 <w:sz w:val="19"/>
                 <w:szCs w:val="19"/>
               </w:rPr>
-              <w:t xml:space="preserve">21, third-year computer science student. Works 12 hours a week at a phone shop.</w:t>
+              <w:t xml:space="preserve">21, Year 3 Computer Science student at NTU. Gives tuition two evenings a week.</w:t>
             </w:r>
           </w:p>
         </w:tc>
@@ -235,7 +235,7 @@
                 <w:sz w:val="19"/>
                 <w:szCs w:val="19"/>
               </w:rPr>
-              <w:t xml:space="preserve">Shares a small flat with two housemates, so studying at home is noisy. The campus library closes at 9pm, but her assignments are usually finished late at night.</w:t>
+              <w:t xml:space="preserve">Lives with her family in a 4-room HDB flat in Tampines, about 1.5 hours from campus by MRT and bus. Home is noisy, so she studies on campus. Lee Wee Nam Library closes at 9.30pm on weeknights during the semester, but her FYP and assignments usually get done late at night.</w:t>
             </w:r>
           </w:p>
         </w:tc>
@@ -289,7 +289,7 @@
                 <w:sz w:val="19"/>
                 <w:szCs w:val="19"/>
               </w:rPr>
-              <w:t xml:space="preserve">Find a place near campus where she can stay 3–4 hours with her laptop, plug in her charger and buy a drink that doesn't cost a fortune.</w:t>
+              <w:t xml:space="preserve">Find a spot on campus where she can stay 3–4 hours with her laptop, plug in her charger, enjoy strong air-con and buy a kopi that doesn't cost a fortune.</w:t>
             </w:r>
           </w:p>
         </w:tc>
@@ -343,7 +343,7 @@
                 <w:sz w:val="19"/>
                 <w:szCs w:val="19"/>
               </w:rPr>
-              <w:t xml:space="preserve">Cafés that close at 6pm, have no sockets, play loud music or make her feel she has to leave after one drink. Menus online that don't show prices.</w:t>
+              <w:t xml:space="preserve">Canteen stalls that close early, seats without plugs, and cafés that charge S$7 for a latte or make her feel she has to leave after one drink. Menus online that don't show prices.</w:t>
             </w:r>
           </w:p>
         </w:tc>
@@ -397,7 +397,7 @@
                 <w:sz w:val="19"/>
                 <w:szCs w:val="19"/>
               </w:rPr>
-              <w:t xml:space="preserve">Searches on her laptop or phone between lectures. Decides quickly: checks prices, opening hours and the vibe from photos. Budget about $5–7 per visit.</w:t>
+              <w:t xml:space="preserve">Searches on her laptop or phone between lectures. Decides quickly: checks prices, opening hours and the vibe from photos. Budget about S$5–8 per visit.</w:t>
             </w:r>
           </w:p>
         </w:tc>
@@ -451,7 +451,7 @@
                 <w:sz w:val="19"/>
                 <w:szCs w:val="19"/>
               </w:rPr>
-              <w:t xml:space="preserve">“I just need a big table, a plug and a coffee I can afford till late.”</w:t>
+              <w:t xml:space="preserve">“I just need a big table, a plug and a kopi I can afford till late.”</w:t>
             </w:r>
           </w:p>
         </w:tc>
@@ -704,7 +704,7 @@
                 <w:sz w:val="19"/>
                 <w:szCs w:val="19"/>
               </w:rPr>
-              <w:t xml:space="preserve">Friend sends her the link, or she searches “study café open late”. Lands on the homepage.</w:t>
+              <w:t xml:space="preserve">A friend shares the link in their project group chat, or she searches “NTU study spot open late”. Lands on the homepage.</w:t>
             </w:r>
           </w:p>
         </w:tc>
@@ -730,7 +730,7 @@
                 <w:sz w:val="19"/>
                 <w:szCs w:val="19"/>
               </w:rPr>
-              <w:t xml:space="preserve">Reads the headline and sees the exam-week deal. Scrolls through today's favourites and the four reasons students stay.</w:t>
+              <w:t xml:space="preserve">Reads the headline and sees the exam season deal. Scrolls through today's favourites and the four reasons students stay.</w:t>
             </w:r>
           </w:p>
         </w:tc>
@@ -756,7 +756,7 @@
                 <w:sz w:val="19"/>
                 <w:szCs w:val="19"/>
               </w:rPr>
-              <w:t xml:space="preserve">Clicks “See the menu”. Checks drink and food prices and the student discount. Reads the story page to get a feel for the place.</w:t>
+              <w:t xml:space="preserve">Clicks “See the menu”. Checks kopi, coffee and food prices and the matric card discount. Reads the story page to get a feel for the place.</w:t>
             </w:r>
           </w:p>
         </w:tc>
@@ -782,7 +782,7 @@
                 <w:sz w:val="19"/>
                 <w:szCs w:val="19"/>
               </w:rPr>
-              <w:t xml:space="preserve">Notes the address and hours from the footer or the “Visit us” box. Goes there after her lecture.</w:t>
+              <w:t xml:space="preserve">Sees it is in North Spine and open till 11pm on weekdays. Walks over after her last tutorial.</w:t>
             </w:r>
           </w:p>
         </w:tc>
@@ -1020,7 +1020,7 @@
                 <w:sz w:val="19"/>
                 <w:szCs w:val="19"/>
               </w:rPr>
-              <w:t xml:space="preserve">“A latte is $4.20, that's fine.”</w:t>
+              <w:t xml:space="preserve">“Kopi-o is S$1.80 with free refills!”</w:t>
             </w:r>
           </w:p>
         </w:tc>
@@ -1593,7 +1593,7 @@
           <w:sz w:val="18"/>
           <w:szCs w:val="18"/>
         </w:rPr>
-        <w:t xml:space="preserve">Figure 4. Content page (Our story): big headline, wide interior photo, article in a readable column, barista section with a link back to the menu.</w:t>
+        <w:t xml:space="preserve">Figure 4. Content page (Our story): big headline, wide photo of Lee Wee Nam Library, article in a readable column, barista section with a link back to the menu.</w:t>
       </w:r>
     </w:p>
     <w:p>
@@ -2535,7 +2535,7 @@
         <w:spacing w:after="60"/>
       </w:pPr>
       <w:r>
-        <w:t xml:space="preserve">Photos: free stock photos from Unsplash (latte over a laptop, latte art, iced latte, croissant, café interior, barista).</w:t>
+        <w:t xml:space="preserve">Photos: free stock photos from Unsplash, chosen to feel local: a barista pulling kopi, kopi in a classic kopitiam cup and kaya toast, plus latte and iced latte shots. The story page uses a real photo of the Lee Wee Nam Library entrance in North Spine (Wikimedia Commons, CC BY-SA 4.0), because the café itself is fictional.</w:t>
       </w:r>
     </w:p>
     <w:sectPr>

</xml_diff>